<commit_message>
Phase 11: fix letterhead header/footer to match the real sample, simplify the launch guide
The letterhead module was misreading the sample (D:\MHTS\MHTS_Letterhead_updated.docx):
its actual "header" is a single large, faint, page-centered watermark logo
behind the text, not a running logo-and-tagline bar. Rebuilt buildHeader()
to use a pre-baked 10%-opacity watermark image, floating and centered on the
page behind the text, matching the sample's own structure. Rebuilt
buildFooter() to match the sample's exact 4-line order (brand/confidentiality
/page, address, phone/web/mobile, GSTIN) instead of a collapsed single line.

Rewrote the Launch & Demo Guide for a true first-time computer user: every
command gets a plain-language explanation, every step is a single action
with a "you should see" confirmation, plus a one-page cheat-sheet at the end.

All six .docx deliverables regenerated and re-validated.

Co-Authored-By: Claude Sonnet 5 <noreply@anthropic.com>
</commit_message>
<xml_diff>
--- a/docs/phase11-deliverables/MHTS-ERP_CA_Compliance_Pack_FINAL.docx
+++ b/docs/phase11-deliverables/MHTS-ERP_CA_Compliance_Pack_FINAL.docx
@@ -7257,10 +7257,7 @@
       <w:pBdr>
         <w:top w:val="single" w:color="D1D5DB" w:sz="4" w:space="6"/>
       </w:pBdr>
-      <w:tabs>
-        <w:tab w:val="right" w:pos="9026"/>
-      </w:tabs>
-      <w:spacing w:before="120"/>
+      <w:spacing w:after="40" w:before="120"/>
     </w:pPr>
     <w:r>
       <w:rPr>
@@ -7269,22 +7266,7 @@
         <w:sz w:val="14"/>
         <w:szCs w:val="14"/>
       </w:rPr>
-      <w:t xml:space="preserve">MHTSdigiXR • KoodaldigiXS • Maanagarram Hi Tech Solutions • Confidential &amp; Proprietary</w:t>
-    </w:r>
-    <w:r>
-      <w:rPr>
-        <w:rFonts w:ascii="Calibri" w:cs="Calibri" w:eastAsia="Calibri" w:hAnsi="Calibri"/>
-      </w:rPr>
-      <w:t xml:space="preserve">	</w:t>
-    </w:r>
-    <w:r>
-      <w:rPr>
-        <w:rFonts w:ascii="Calibri" w:cs="Calibri" w:eastAsia="Calibri" w:hAnsi="Calibri"/>
-        <w:color w:val="6B7280"/>
-        <w:sz w:val="14"/>
-        <w:szCs w:val="14"/>
-      </w:rPr>
-      <w:t xml:space="preserve">Page </w:t>
+      <w:t xml:space="preserve">MHTSdigiXR • KoodaldigiXS • Maanagarram Hi Tech Solutions • Confidential &amp; Proprietary • Page </w:t>
     </w:r>
     <w:r>
       <w:rPr>
@@ -7298,6 +7280,11 @@
       <w:fldChar w:fldCharType="separate"/>
       <w:fldChar w:fldCharType="end"/>
     </w:r>
+  </w:p>
+  <w:p>
+    <w:pPr>
+      <w:spacing w:after="40"/>
+    </w:pPr>
     <w:r>
       <w:rPr>
         <w:rFonts w:ascii="Calibri" w:cs="Calibri" w:eastAsia="Calibri" w:hAnsi="Calibri"/>
@@ -7305,8 +7292,13 @@
         <w:sz w:val="14"/>
         <w:szCs w:val="14"/>
       </w:rPr>
-      <w:t xml:space="preserve"> of </w:t>
+      <w:t xml:space="preserve">No 4056, 5th Main Road, Ayyapakam, Chennai, Tamil Nadu, India – 600077</w:t>
     </w:r>
+  </w:p>
+  <w:p>
+    <w:pPr>
+      <w:spacing w:after="40"/>
+    </w:pPr>
     <w:r>
       <w:rPr>
         <w:rFonts w:ascii="Calibri" w:cs="Calibri" w:eastAsia="Calibri" w:hAnsi="Calibri"/>
@@ -7314,10 +7306,7 @@
         <w:sz w:val="14"/>
         <w:szCs w:val="14"/>
       </w:rPr>
-      <w:fldChar w:fldCharType="begin"/>
-      <w:instrText xml:space="preserve">NUMPAGES</w:instrText>
-      <w:fldChar w:fldCharType="separate"/>
-      <w:fldChar w:fldCharType="end"/>
+      <w:t xml:space="preserve">Tel: 044-47740195 | Web: www.mhtsdigixr.com • www.koodaldigixs.com | Mob: +91 7358105995 |</w:t>
     </w:r>
   </w:p>
   <w:p>
@@ -7325,10 +7314,10 @@
       <w:rPr>
         <w:rFonts w:ascii="Calibri" w:cs="Calibri" w:eastAsia="Calibri" w:hAnsi="Calibri"/>
         <w:color w:val="6B7280"/>
-        <w:sz w:val="12"/>
-        <w:szCs w:val="12"/>
+        <w:sz w:val="14"/>
+        <w:szCs w:val="14"/>
       </w:rPr>
-      <w:t xml:space="preserve">No 4056, 5th Main Road, Ayyapakam, Chennai, Tamil Nadu, India – 600077  |  Tel: 044-47740195  |  Mob: +91 7358105995  |  www.mhtsdigixr.com  |  GSTIN: 33AMFPR8672L1Z</w:t>
+      <w:t xml:space="preserve">GSTIN: 33AMFPR8672L1Z |</w:t>
     </w:r>
   </w:p>
 </w:ftr>
@@ -7374,20 +7363,19 @@
 <file path=word/header1.xml><?xml version="1.0" encoding="utf-8"?>
 <w:hdr xmlns:wpc="http://schemas.microsoft.com/office/word/2010/wordprocessingCanvas" xmlns:mc="http://schemas.openxmlformats.org/markup-compatibility/2006" xmlns:o="urn:schemas-microsoft-com:office:office" xmlns:r="http://schemas.openxmlformats.org/officeDocument/2006/relationships" xmlns:m="http://schemas.openxmlformats.org/officeDocument/2006/math" xmlns:v="urn:schemas-microsoft-com:vml" xmlns:wp14="http://schemas.microsoft.com/office/word/2010/wordprocessingDrawing" xmlns:wp="http://schemas.openxmlformats.org/drawingml/2006/wordprocessingDrawing" xmlns:w10="urn:schemas-microsoft-com:office:word" xmlns:w="http://schemas.openxmlformats.org/wordprocessingml/2006/main" xmlns:w14="http://schemas.microsoft.com/office/word/2010/wordml" xmlns:w15="http://schemas.microsoft.com/office/word/2012/wordml" xmlns:wpg="http://schemas.microsoft.com/office/word/2010/wordprocessingGroup" xmlns:wpi="http://schemas.microsoft.com/office/word/2010/wordprocessingInk" xmlns:wne="http://schemas.microsoft.com/office/word/2006/wordml" xmlns:wps="http://schemas.microsoft.com/office/word/2010/wordprocessingShape" xmlns:cx="http://schemas.microsoft.com/office/drawing/2014/chartex" xmlns:cx1="http://schemas.microsoft.com/office/drawing/2015/9/8/chartex" xmlns:cx2="http://schemas.microsoft.com/office/drawing/2015/10/21/chartex" xmlns:cx3="http://schemas.microsoft.com/office/drawing/2016/5/9/chartex" xmlns:cx4="http://schemas.microsoft.com/office/drawing/2016/5/10/chartex" xmlns:cx5="http://schemas.microsoft.com/office/drawing/2016/5/11/chartex" xmlns:cx6="http://schemas.microsoft.com/office/drawing/2016/5/12/chartex" xmlns:cx7="http://schemas.microsoft.com/office/drawing/2016/5/13/chartex" xmlns:cx8="http://schemas.microsoft.com/office/drawing/2016/5/14/chartex" xmlns:w16cid="http://schemas.microsoft.com/office/word/2016/wordml/cid" xmlns:w16se="http://schemas.microsoft.com/office/word/2015/wordml/symex">
   <w:p>
-    <w:pPr>
-      <w:pBdr>
-        <w:bottom w:val="single" w:color="2563EB" w:sz="6" w:space="6"/>
-      </w:pBdr>
-      <w:tabs>
-        <w:tab w:val="right" w:pos="9026"/>
-      </w:tabs>
-      <w:spacing w:after="120"/>
-    </w:pPr>
     <w:r>
       <w:drawing>
-        <wp:inline distT="0" distB="0" distL="0" distR="0">
-          <wp:extent cx="857250" cy="533400"/>
+        <wp:anchor distT="0" distB="0" distL="0" distR="0" simplePos="0" allowOverlap="1" behindDoc="1" locked="0" layoutInCell="1" relativeHeight="3810000">
+          <wp:simplePos x="0" y="0"/>
+          <wp:positionH relativeFrom="page">
+            <wp:align>center</wp:align>
+          </wp:positionH>
+          <wp:positionV relativeFrom="page">
+            <wp:align>center</wp:align>
+          </wp:positionV>
+          <wp:extent cx="3810000" cy="3810000"/>
           <wp:effectExtent t="0" r="0" b="0" l="0"/>
+          <wp:wrapNone/>
           <wp:docPr id="1" name="" descr="" title=""/>
           <wp:cNvGraphicFramePr>
             <a:graphicFrameLocks xmlns:a="http://schemas.openxmlformats.org/drawingml/2006/main" noChangeAspect="1"/>
@@ -7411,7 +7399,7 @@
                 <pic:spPr bwMode="auto">
                   <a:xfrm>
                     <a:off x="0" y="0"/>
-                    <a:ext cx="857250" cy="533400"/>
+                    <a:ext cx="3810000" cy="3810000"/>
                   </a:xfrm>
                   <a:prstGeom prst="rect">
                     <a:avLst/>
@@ -7420,25 +7408,8 @@
               </pic:pic>
             </a:graphicData>
           </a:graphic>
-        </wp:inline>
+        </wp:anchor>
       </w:drawing>
-    </w:r>
-    <w:r>
-      <w:rPr>
-        <w:rFonts w:ascii="Calibri" w:cs="Calibri" w:eastAsia="Calibri" w:hAnsi="Calibri"/>
-      </w:rPr>
-      <w:t xml:space="preserve">	</w:t>
-    </w:r>
-    <w:r>
-      <w:rPr>
-        <w:rFonts w:ascii="Calibri" w:cs="Calibri" w:eastAsia="Calibri" w:hAnsi="Calibri"/>
-        <w:i/>
-        <w:iCs/>
-        <w:color w:val="6B7280"/>
-        <w:sz w:val="16"/>
-        <w:szCs w:val="16"/>
-      </w:rPr>
-      <w:t xml:space="preserve">Business Accounting • GST • Inventory • Payroll</w:t>
     </w:r>
   </w:p>
 </w:hdr>

</xml_diff>